<commit_message>
Added security recommendations in the log
</commit_message>
<xml_diff>
--- a/security_audit_report.docx
+++ b/security_audit_report.docx
@@ -12629,6 +12629,161 @@
       <w:pPr>
         <w:spacing w:after="40"/>
       </w:pPr>
+    </w:p>
+    <w:p>
+      <w:r>
+        <w:br w:type="page"/>
+      </w:r>
+    </w:p>
+    <w:p>
+      <w:pPr>
+        <w:pStyle w:val="Heading1"/>
+      </w:pPr>
+      <w:r>
+        <w:t>Final Recommendations</w:t>
+      </w:r>
+    </w:p>
+    <w:p>
+      <w:pPr>
+        <w:spacing w:after="200"/>
+      </w:pPr>
+      <w:r>
+        <w:t>The following actions are recommended to improve Pocket Trainer security posture, reduce account-compromise risk, and establish a repeatable security engineering baseline.</w:t>
+      </w:r>
+    </w:p>
+    <w:p>
+      <w:pPr>
+        <w:pStyle w:val="ListNumber"/>
+        <w:spacing w:after="120"/>
+      </w:pPr>
+      <w:r>
+        <w:rPr>
+          <w:b/>
+        </w:rPr>
+        <w:t xml:space="preserve">1. Establish a 0-14 day security release gate: </w:t>
+      </w:r>
+      <w:r>
+        <w:t>Block broad production release until PT-01 through PT-04 are remediated, tested, and peer reviewed. This gate should require a non-empty JWT secret, secure token storage, reset abuse controls, and strict AI-output validation.</w:t>
+      </w:r>
+    </w:p>
+    <w:p>
+      <w:pPr>
+        <w:pStyle w:val="ListNumber"/>
+        <w:spacing w:after="120"/>
+      </w:pPr>
+      <w:r>
+        <w:rPr>
+          <w:b/>
+        </w:rPr>
+        <w:t xml:space="preserve">2. Make identity controls fail closed: </w:t>
+      </w:r>
+      <w:r>
+        <w:t>Validate required deployment secrets at startup, remove fallback credentials, use 10-15 minute access tokens, rotate refresh tokens, and invalidate all sessions after password reset, password change, or suspicious activity.</w:t>
+      </w:r>
+    </w:p>
+    <w:p>
+      <w:pPr>
+        <w:pStyle w:val="ListNumber"/>
+        <w:spacing w:after="120"/>
+      </w:pPr>
+      <w:r>
+        <w:rPr>
+          <w:b/>
+        </w:rPr>
+        <w:t xml:space="preserve">3. Replace the password-reset workflow: </w:t>
+      </w:r>
+      <w:r>
+        <w:t>Use crypto.randomInt for OTP generation, remove all OTP logging, deliver codes only through a trusted channel, and add IP/account rate limits, cooldowns, attempt counters, and monitoring.</w:t>
+      </w:r>
+    </w:p>
+    <w:p>
+      <w:pPr>
+        <w:pStyle w:val="ListNumber"/>
+        <w:spacing w:after="120"/>
+      </w:pPr>
+      <w:r>
+        <w:rPr>
+          <w:b/>
+        </w:rPr>
+        <w:t xml:space="preserve">4. Treat AI output as untrusted input: </w:t>
+      </w:r>
+      <w:r>
+        <w:t>Implement strict Zod schemas for generated plans and chat actions, reject unknown fields, constrain repetitions/rest/exercise counts, and require user confirmation or versioned rollback before plan replacement.</w:t>
+      </w:r>
+    </w:p>
+    <w:p>
+      <w:pPr>
+        <w:pStyle w:val="ListNumber"/>
+        <w:spacing w:after="120"/>
+      </w:pPr>
+      <w:r>
+        <w:rPr>
+          <w:b/>
+        </w:rPr>
+        <w:t xml:space="preserve">5. Add an API protection layer: </w:t>
+      </w:r>
+      <w:r>
+        <w:t>Apply route-specific validation, body-size limits, rate limits, an explicit CORS allowlist, and centralized error handling with correlation IDs and redacted logs.</w:t>
+      </w:r>
+    </w:p>
+    <w:p>
+      <w:pPr>
+        <w:pStyle w:val="ListNumber"/>
+        <w:spacing w:after="120"/>
+      </w:pPr>
+      <w:r>
+        <w:rPr>
+          <w:b/>
+        </w:rPr>
+        <w:t xml:space="preserve">6. Protect biometric-adjacent data: </w:t>
+      </w:r>
+      <w:r>
+        <w:t>Document data inventory, retention, deletion, and vendor sharing. Minimize data sent to Modal, use least-privilege MongoDB access, and verify Atlas network/TLS/backup/audit settings.</w:t>
+      </w:r>
+    </w:p>
+    <w:p>
+      <w:pPr>
+        <w:pStyle w:val="ListNumber"/>
+        <w:spacing w:after="120"/>
+      </w:pPr>
+      <w:r>
+        <w:rPr>
+          <w:b/>
+        </w:rPr>
+        <w:t xml:space="preserve">7. Build security into delivery: </w:t>
+      </w:r>
+      <w:r>
+        <w:t>Add CI checks for npm audit, SAST, secret scanning, dependency monitoring, and tests for authorization, OTP throttling, AI schema failures, and replay/concurrency behavior.</w:t>
+      </w:r>
+    </w:p>
+    <w:p>
+      <w:pPr>
+        <w:pStyle w:val="ListNumber"/>
+        <w:spacing w:after="120"/>
+      </w:pPr>
+      <w:r>
+        <w:rPr>
+          <w:b/>
+        </w:rPr>
+        <w:t xml:space="preserve">8. Create an operating cadence: </w:t>
+      </w:r>
+      <w:r>
+        <w:t>Assign owners, due dates, and evidence requirements for each finding. Review authentication failures, reset activity, AI usage/cost, dependency advisories, and cloud access at least monthly.</w:t>
+      </w:r>
+    </w:p>
+    <w:p>
+      <w:pPr>
+        <w:spacing w:before="160"/>
+      </w:pPr>
+      <w:r>
+        <w:rPr>
+          <w:b/>
+        </w:rPr>
+        <w:t xml:space="preserve">Recommended success measure: </w:t>
+      </w:r>
+      <w:r>
+        <w:t>all Immediate items verified in a staging environment before release, followed by quarterly evidence-based security reviews.</w:t>
+      </w:r>
     </w:p>
     <w:sectPr>
       <w:footerReference w:type="default" r:id="rId9"/>

</xml_diff>